<commit_message>
mejoras en la gestión de tickets, tickets detalle. Recuperar contraseña, con envio de link al correo electrónico.
</commit_message>
<xml_diff>
--- a/notas_nxg-quill.docx
+++ b/notas_nxg-quill.docx
@@ -68,7 +68,7 @@
           <w:lang w:val="es-EC"/>
         </w:rPr>
         <w:pict w14:anchorId="22E709D1">
-          <v:rect id="_x0000_i1049" style="width:0;height:1.5pt" o:hralign="center" o:hrstd="t" o:hr="t" fillcolor="#a0a0a0" stroked="f"/>
+          <v:rect id="_x0000_i1025" style="width:0;height:1.5pt" o:hralign="center" o:hrstd="t" o:hr="t" fillcolor="#a0a0a0" stroked="f"/>
         </w:pict>
       </w:r>
     </w:p>
@@ -854,7 +854,7 @@
           <w:lang w:val="es-EC"/>
         </w:rPr>
         <w:pict w14:anchorId="14705558">
-          <v:rect id="_x0000_i1050" style="width:0;height:1.5pt" o:hralign="center" o:hrstd="t" o:hr="t" fillcolor="#a0a0a0" stroked="f"/>
+          <v:rect id="_x0000_i1026" style="width:0;height:1.5pt" o:hralign="center" o:hrstd="t" o:hr="t" fillcolor="#a0a0a0" stroked="f"/>
         </w:pict>
       </w:r>
     </w:p>
@@ -1533,7 +1533,7 @@
           <w:lang w:val="es-EC"/>
         </w:rPr>
         <w:pict w14:anchorId="3486D036">
-          <v:rect id="_x0000_i1051" style="width:0;height:1.5pt" o:hralign="center" o:hrstd="t" o:hr="t" fillcolor="#a0a0a0" stroked="f"/>
+          <v:rect id="_x0000_i1027" style="width:0;height:1.5pt" o:hralign="center" o:hrstd="t" o:hr="t" fillcolor="#a0a0a0" stroked="f"/>
         </w:pict>
       </w:r>
     </w:p>
@@ -2131,7 +2131,7 @@
           <w:lang w:val="es-EC"/>
         </w:rPr>
         <w:pict w14:anchorId="32EE66C8">
-          <v:rect id="_x0000_i1052" style="width:0;height:1.5pt" o:hralign="center" o:hrstd="t" o:hr="t" fillcolor="#a0a0a0" stroked="f"/>
+          <v:rect id="_x0000_i1028" style="width:0;height:1.5pt" o:hralign="center" o:hrstd="t" o:hr="t" fillcolor="#a0a0a0" stroked="f"/>
         </w:pict>
       </w:r>
     </w:p>
@@ -2372,12 +2372,12 @@
     <w:p>
       <w:pPr>
         <w:rPr>
-          <w:lang w:val="es-EC"/>
-        </w:rPr>
-      </w:pPr>
-      <w:r>
-        <w:rPr>
-          <w:lang w:val="es-EC"/>
+          <w:lang w:val="en-US"/>
+        </w:rPr>
+      </w:pPr>
+      <w:r>
+        <w:rPr>
+          <w:lang w:val="en-US"/>
         </w:rPr>
         <w:t>En php.ini</w:t>
       </w:r>
@@ -2385,7 +2385,7 @@
     <w:p>
       <w:pPr>
         <w:rPr>
-          <w:lang w:val="es-EC"/>
+          <w:lang w:val="en-US"/>
         </w:rPr>
       </w:pPr>
     </w:p>
@@ -2475,20 +2475,20 @@
     <w:p>
       <w:pPr>
         <w:rPr>
-          <w:lang w:val="en-US"/>
-        </w:rPr>
-      </w:pPr>
-      <w:proofErr w:type="spellStart"/>
-      <w:r>
-        <w:rPr>
-          <w:lang w:val="en-US"/>
+          <w:lang w:val="es-EC"/>
+        </w:rPr>
+      </w:pPr>
+      <w:proofErr w:type="spellStart"/>
+      <w:r>
+        <w:rPr>
+          <w:lang w:val="es-EC"/>
         </w:rPr>
         <w:t>post_max_size</w:t>
       </w:r>
       <w:proofErr w:type="spellEnd"/>
       <w:r>
         <w:rPr>
-          <w:lang w:val="en-US"/>
+          <w:lang w:val="es-EC"/>
         </w:rPr>
         <w:t xml:space="preserve"> = 128M</w:t>
       </w:r>
@@ -2496,7 +2496,7 @@
     <w:p>
       <w:pPr>
         <w:rPr>
-          <w:lang w:val="en-US"/>
+          <w:lang w:val="es-EC"/>
         </w:rPr>
       </w:pPr>
     </w:p>
@@ -2955,6 +2955,12 @@
         <w:rPr>
           <w:lang w:val="es-EC"/>
         </w:rPr>
+        <w:t>ticket.</w:t>
+      </w:r>
+      <w:r>
+        <w:rPr>
+          <w:lang w:val="es-EC"/>
+        </w:rPr>
         <w:t>controllet.php</w:t>
       </w:r>
       <w:proofErr w:type="spellEnd"/>
@@ -2962,30 +2968,14 @@
         <w:rPr>
           <w:lang w:val="es-EC"/>
         </w:rPr>
-        <w:t xml:space="preserve"> para validar el tamaño,  se deja en 512, se realiza prueba y ya almaceno una q antes no </w:t>
-      </w:r>
-    </w:p>
-    <w:p>
-      <w:pPr>
-        <w:rPr>
-          <w:lang w:val="es-EC"/>
-        </w:rPr>
-      </w:pPr>
-    </w:p>
-    <w:p>
-      <w:pPr>
-        <w:rPr>
-          <w:lang w:val="es-EC"/>
-        </w:rPr>
-      </w:pPr>
-      <w:proofErr w:type="spellStart"/>
-      <w:r>
-        <w:rPr>
-          <w:lang w:val="es-EC"/>
-        </w:rPr>
-        <w:t>Tambien</w:t>
-      </w:r>
-      <w:proofErr w:type="spellEnd"/>
+        <w:t xml:space="preserve"> para validar el tamaño,  se deja en 512, se realiza prueba y ya almaceno una q antes no</w:t>
+      </w:r>
+      <w:r>
+        <w:rPr>
+          <w:lang w:val="es-EC"/>
+        </w:rPr>
+        <w:t>, También</w:t>
+      </w:r>
       <w:r>
         <w:rPr>
           <w:lang w:val="es-EC"/>
@@ -3016,6 +3006,7 @@
       </w:pPr>
       <w:r>
         <w:rPr>
+          <w:noProof/>
           <w:lang w:val="es-EC"/>
         </w:rPr>
         <w:lastRenderedPageBreak/>
@@ -3071,6 +3062,7 @@
       </w:pPr>
       <w:r>
         <w:rPr>
+          <w:noProof/>
           <w:lang w:val="es-EC"/>
         </w:rPr>
         <w:lastRenderedPageBreak/>
@@ -3197,7 +3189,7 @@
     <w:p>
       <w:pPr>
         <w:rPr>
-          <w:lang w:val="es-EC"/>
+          <w:lang w:val="en-US"/>
         </w:rPr>
       </w:pPr>
       <w:r>
@@ -3208,22 +3200,64 @@
       </w:r>
       <w:r>
         <w:rPr>
-          <w:lang w:val="es-EC"/>
-        </w:rPr>
-        <w:t>$titulo = $_POST["titulo"];</w:t>
-      </w:r>
-    </w:p>
-    <w:p>
-      <w:pPr>
-        <w:rPr>
-          <w:lang w:val="es-EC"/>
-        </w:rPr>
-      </w:pPr>
-      <w:r>
-        <w:rPr>
-          <w:lang w:val="es-EC"/>
-        </w:rPr>
-        <w:t xml:space="preserve">    $</w:t>
+          <w:lang w:val="en-US"/>
+        </w:rPr>
+        <w:t>$</w:t>
+      </w:r>
+      <w:proofErr w:type="spellStart"/>
+      <w:r>
+        <w:rPr>
+          <w:lang w:val="en-US"/>
+        </w:rPr>
+        <w:t>titulo</w:t>
+      </w:r>
+      <w:proofErr w:type="spellEnd"/>
+      <w:r>
+        <w:rPr>
+          <w:lang w:val="en-US"/>
+        </w:rPr>
+        <w:t xml:space="preserve"> = $_POST["</w:t>
+      </w:r>
+      <w:proofErr w:type="spellStart"/>
+      <w:r>
+        <w:rPr>
+          <w:lang w:val="en-US"/>
+        </w:rPr>
+        <w:t>titulo</w:t>
+      </w:r>
+      <w:proofErr w:type="spellEnd"/>
+      <w:r>
+        <w:rPr>
+          <w:lang w:val="en-US"/>
+        </w:rPr>
+        <w:t>"</w:t>
+      </w:r>
+      <w:proofErr w:type="gramStart"/>
+      <w:r>
+        <w:rPr>
+          <w:lang w:val="en-US"/>
+        </w:rPr>
+        <w:t>];</w:t>
+      </w:r>
+      <w:proofErr w:type="gramEnd"/>
+    </w:p>
+    <w:p>
+      <w:pPr>
+        <w:rPr>
+          <w:lang w:val="es-EC"/>
+        </w:rPr>
+      </w:pPr>
+      <w:r>
+        <w:rPr>
+          <w:lang w:val="en-US"/>
+        </w:rPr>
+        <w:t xml:space="preserve">    </w:t>
+      </w:r>
+      <w:r>
+        <w:rPr>
+          <w:lang w:val="es-EC"/>
+        </w:rPr>
+        <w:t>$</w:t>
       </w:r>
       <w:proofErr w:type="spellStart"/>
       <w:r>
@@ -4067,21 +4101,7 @@
         <w:rPr>
           <w:lang w:val="es-EC"/>
         </w:rPr>
-        <w:t xml:space="preserve"> </w:t>
-      </w:r>
-      <w:proofErr w:type="spellStart"/>
-      <w:r>
-        <w:rPr>
-          <w:lang w:val="es-EC"/>
-        </w:rPr>
-        <w:t>value</w:t>
-      </w:r>
-      <w:proofErr w:type="spellEnd"/>
-      <w:r>
-        <w:rPr>
-          <w:lang w:val="es-EC"/>
-        </w:rPr>
-        <w:t xml:space="preserve"> = </w:t>
+        <w:t xml:space="preserve"> value = </w:t>
       </w:r>
       <w:proofErr w:type="spellStart"/>
       <w:r>
@@ -5004,6 +5024,7 @@
   <w:style w:type="character" w:default="1" w:styleId="Fuentedeprrafopredeter">
     <w:name w:val="Default Paragraph Font"/>
     <w:uiPriority w:val="1"/>
+    <w:semiHidden/>
     <w:unhideWhenUsed/>
   </w:style>
   <w:style w:type="table" w:default="1" w:styleId="Tablanormal">

</xml_diff>